<commit_message>
Acta de entrega: quitar teléfono, supervisor, proforma, unidad, verificación y garantía
Co-Authored-By: Claude Opus 5.5 <noreply@anthropic.com>
Claude-Session: https://claude.ai/code/session_011SdWdiecD9sUenR1iiosjD
</commit_message>
<xml_diff>
--- a/documentos/ACTA_DE_ENTREGA_RACKSA_ECUADOR.docx
+++ b/documentos/ACTA_DE_ENTREGA_RACKSA_ECUADOR.docx
@@ -2,68 +2,9 @@
 <file path=word/document.xml><?xml version="1.0" encoding="utf-8"?>
 <w:document xmlns:wpc="http://schemas.microsoft.com/office/word/2010/wordprocessingCanvas" xmlns:mo="http://schemas.microsoft.com/office/mac/office/2008/main" xmlns:mc="http://schemas.openxmlformats.org/markup-compatibility/2006" xmlns:mv="urn:schemas-microsoft-com:mac:vml" xmlns:o="urn:schemas-microsoft-com:office:office" xmlns:r="http://schemas.openxmlformats.org/officeDocument/2006/relationships" xmlns:m="http://schemas.openxmlformats.org/officeDocument/2006/math" xmlns:v="urn:schemas-microsoft-com:vml" xmlns:wp14="http://schemas.microsoft.com/office/word/2010/wordprocessingDrawing" xmlns:wp="http://schemas.openxmlformats.org/drawingml/2006/wordprocessingDrawing" xmlns:w10="urn:schemas-microsoft-com:office:word" xmlns:w="http://schemas.openxmlformats.org/wordprocessingml/2006/main" xmlns:w14="http://schemas.microsoft.com/office/word/2010/wordml" xmlns:wpg="http://schemas.microsoft.com/office/word/2010/wordprocessingGroup" xmlns:wpi="http://schemas.microsoft.com/office/word/2010/wordprocessingInk" xmlns:wne="http://schemas.microsoft.com/office/word/2006/wordml" xmlns:wps="http://schemas.microsoft.com/office/word/2010/wordprocessingShape" mc:Ignorable="w14 wp14">
   <w:body>
-    <w:tbl>
-      <w:tblPr>
-        <w:tblLook w:firstColumn="1" w:firstRow="1" w:lastColumn="0" w:lastRow="0" w:noHBand="0" w:noVBand="1" w:val="04A0"/>
-        <w:tblBorders>
-          <w:top w:val="nil"/>
-          <w:left w:val="nil"/>
-          <w:bottom w:val="nil"/>
-          <w:right w:val="nil"/>
-          <w:insideH w:val="nil"/>
-          <w:insideV w:val="nil"/>
-        </w:tblBorders>
-        <w:tblLayout w:type="fixed"/>
-        <w:tblCellMar>
-          <w:top w:w="80" w:type="dxa"/>
-          <w:left w:w="160" w:type="dxa"/>
-          <w:bottom w:w="80" w:type="dxa"/>
-          <w:right w:w="160" w:type="dxa"/>
-        </w:tblCellMar>
-        <w:tblLayout w:type="fixed"/>
-        <w:tblW w:w="10206" w:type="dxa"/>
-      </w:tblPr>
-      <w:tblGrid>
-        <w:gridCol w:w="10206"/>
-      </w:tblGrid>
-      <w:tr>
-        <w:tc>
-          <w:tcPr>
-            <w:tcW w:type="dxa" w:w="10205"/>
-            <w:shd w:val="clear" w:color="auto" w:fill="0F4C9D"/>
-            <w:vAlign w:val="center"/>
-          </w:tcPr>
-          <w:p>
-            <w:pPr>
-              <w:jc w:val="left"/>
-            </w:pPr>
-            <w:r>
-              <w:rPr>
-                <w:rFonts w:ascii="Poppins SemiBold" w:hAnsi="Poppins SemiBold"/>
-                <w:b w:val="0"/>
-                <w:color w:val="FFFFFF"/>
-                <w:sz w:val="23"/>
-              </w:rPr>
-              <w:t>ACTA DE ENTREGA-RECEPCIÓN DE OBRA E INSTALACIÓN</w:t>
-            </w:r>
-          </w:p>
-          <w:p>
-            <w:r>
-              <w:rPr>
-                <w:rFonts w:ascii="Poppins" w:hAnsi="Poppins"/>
-                <w:b w:val="0"/>
-                <w:color w:val="DCE6F4"/>
-                <w:sz w:val="16"/>
-              </w:rPr>
-              <w:t>Sistemas de almacenamiento, estructuras metálicas y servicios intralogísticos</w:t>
-            </w:r>
-          </w:p>
-        </w:tc>
-      </w:tr>
-    </w:tbl>
     <w:p>
       <w:pPr>
-        <w:spacing w:before="0" w:after="0" w:line="80" w:lineRule="exact"/>
+        <w:spacing w:before="0" w:after="0" w:line="40" w:lineRule="exact"/>
       </w:pPr>
     </w:p>
     <w:p>
@@ -78,12 +19,12 @@
           <w:color w:val="1E2633"/>
           <w:sz w:val="18"/>
         </w:rPr>
-        <w:t>En la ciudad de ____________________, a los ____ días del mes de ____________________ de 20____, se reúnen los representantes de RACKSA ECUADOR y del CLIENTE para realizar la entrega y recepción de los bienes y trabajos detallados en la presente acta, de acuerdo con la proforma, contrato u orden de trabajo indicada.</w:t>
+        <w:t>En la ciudad de ____________________, a los ____ días del mes de ____________________ de 20____, se reúnen los representantes de RACKSA ECUADOR y del CLIENTE para realizar la entrega y recepción de los bienes y trabajos detallados en la presente acta, de acuerdo con el proyecto u orden de trabajo indicado.</w:t>
       </w:r>
     </w:p>
     <w:p>
       <w:pPr>
-        <w:spacing w:before="0" w:after="0" w:line="140" w:lineRule="exact"/>
+        <w:spacing w:before="0" w:after="0" w:line="120" w:lineRule="exact"/>
       </w:pPr>
     </w:p>
     <w:tbl>
@@ -126,6 +67,7 @@
           </w:tcPr>
           <w:p>
             <w:pPr>
+              <w:keepNext/>
               <w:jc w:val="center"/>
             </w:pPr>
             <w:r>
@@ -149,6 +91,7 @@
           </w:tcPr>
           <w:p>
             <w:pPr>
+              <w:keepNext/>
               <w:jc w:val="left"/>
             </w:pPr>
             <w:r>
@@ -356,7 +299,7 @@
                 <w:color w:val="082A5C"/>
                 <w:sz w:val="16"/>
               </w:rPr>
-              <w:t>Teléfono</w:t>
+              <w:t>Proyecto / OT</w:t>
             </w:r>
           </w:p>
         </w:tc>
@@ -437,108 +380,8 @@
         </w:tc>
         <w:tc>
           <w:tcPr>
-            <w:tcW w:type="dxa" w:w="2948"/>
-            <w:vAlign w:val="center"/>
-          </w:tcPr>
-          <w:p>
-            <w:pPr>
-              <w:jc w:val="left"/>
-            </w:pPr>
-          </w:p>
-        </w:tc>
-        <w:tc>
-          <w:tcPr>
-            <w:tcW w:type="dxa" w:w="1814"/>
-            <w:shd w:val="clear" w:color="auto" w:fill="EEF3FA"/>
-            <w:vAlign w:val="center"/>
-          </w:tcPr>
-          <w:p>
-            <w:pPr>
-              <w:jc w:val="left"/>
-            </w:pPr>
-            <w:r>
-              <w:rPr>
-                <w:rFonts w:ascii="Poppins SemiBold" w:hAnsi="Poppins SemiBold"/>
-                <w:b w:val="0"/>
-                <w:color w:val="082A5C"/>
-                <w:sz w:val="16"/>
-              </w:rPr>
-              <w:t>Proyecto / OT</w:t>
-            </w:r>
-          </w:p>
-        </w:tc>
-        <w:tc>
-          <w:tcPr>
-            <w:tcW w:type="dxa" w:w="3175"/>
-            <w:vAlign w:val="center"/>
-          </w:tcPr>
-          <w:p>
-            <w:pPr>
-              <w:jc w:val="left"/>
-            </w:pPr>
-          </w:p>
-        </w:tc>
-      </w:tr>
-      <w:tr>
-        <w:trPr>
-          <w:trHeight w:val="374" w:hRule="atLeast"/>
-        </w:trPr>
-        <w:tc>
-          <w:tcPr>
-            <w:tcW w:type="dxa" w:w="2268"/>
-            <w:shd w:val="clear" w:color="auto" w:fill="EEF3FA"/>
-            <w:vAlign w:val="center"/>
-          </w:tcPr>
-          <w:p>
-            <w:pPr>
-              <w:jc w:val="left"/>
-            </w:pPr>
-            <w:r>
-              <w:rPr>
-                <w:rFonts w:ascii="Poppins SemiBold" w:hAnsi="Poppins SemiBold"/>
-                <w:b w:val="0"/>
-                <w:color w:val="082A5C"/>
-                <w:sz w:val="16"/>
-              </w:rPr>
-              <w:t>Proforma / Contrato N.º</w:t>
-            </w:r>
-          </w:p>
-        </w:tc>
-        <w:tc>
-          <w:tcPr>
-            <w:tcW w:type="dxa" w:w="2948"/>
-            <w:vAlign w:val="center"/>
-          </w:tcPr>
-          <w:p>
-            <w:pPr>
-              <w:jc w:val="left"/>
-            </w:pPr>
-          </w:p>
-        </w:tc>
-        <w:tc>
-          <w:tcPr>
-            <w:tcW w:type="dxa" w:w="1814"/>
-            <w:shd w:val="clear" w:color="auto" w:fill="EEF3FA"/>
-            <w:vAlign w:val="center"/>
-          </w:tcPr>
-          <w:p>
-            <w:pPr>
-              <w:jc w:val="left"/>
-            </w:pPr>
-            <w:r>
-              <w:rPr>
-                <w:rFonts w:ascii="Poppins SemiBold" w:hAnsi="Poppins SemiBold"/>
-                <w:b w:val="0"/>
-                <w:color w:val="082A5C"/>
-                <w:sz w:val="16"/>
-              </w:rPr>
-              <w:t>Supervisor Racksa</w:t>
-            </w:r>
-          </w:p>
-        </w:tc>
-        <w:tc>
-          <w:tcPr>
-            <w:tcW w:type="dxa" w:w="3175"/>
+            <w:tcW w:type="dxa" w:w="7937"/>
+            <w:gridSpan w:val="3"/>
             <w:vAlign w:val="center"/>
           </w:tcPr>
           <w:p>
@@ -594,6 +437,7 @@
           </w:tcPr>
           <w:p>
             <w:pPr>
+              <w:keepNext/>
               <w:jc w:val="center"/>
             </w:pPr>
             <w:r>
@@ -617,6 +461,7 @@
           </w:tcPr>
           <w:p>
             <w:pPr>
+              <w:keepNext/>
               <w:jc w:val="left"/>
             </w:pPr>
             <w:r>
@@ -660,10 +505,9 @@
       </w:tblPr>
       <w:tblGrid>
         <w:gridCol w:w="567"/>
-        <w:gridCol w:w="4649"/>
-        <w:gridCol w:w="1020"/>
-        <w:gridCol w:w="1020"/>
-        <w:gridCol w:w="2948"/>
+        <w:gridCol w:w="5443"/>
+        <w:gridCol w:w="1134"/>
+        <w:gridCol w:w="3061"/>
       </w:tblGrid>
       <w:tr>
         <w:trPr>
@@ -693,7 +537,7 @@
         </w:tc>
         <w:tc>
           <w:tcPr>
-            <w:tcW w:type="dxa" w:w="4649"/>
+            <w:tcW w:type="dxa" w:w="5443"/>
             <w:shd w:val="clear" w:color="auto" w:fill="0F4C9D"/>
             <w:vAlign w:val="center"/>
           </w:tcPr>
@@ -714,7 +558,7 @@
         </w:tc>
         <w:tc>
           <w:tcPr>
-            <w:tcW w:type="dxa" w:w="1020"/>
+            <w:tcW w:type="dxa" w:w="1134"/>
             <w:shd w:val="clear" w:color="auto" w:fill="0F4C9D"/>
             <w:vAlign w:val="center"/>
           </w:tcPr>
@@ -735,28 +579,7 @@
         </w:tc>
         <w:tc>
           <w:tcPr>
-            <w:tcW w:type="dxa" w:w="1020"/>
-            <w:shd w:val="clear" w:color="auto" w:fill="0F4C9D"/>
-            <w:vAlign w:val="center"/>
-          </w:tcPr>
-          <w:p>
-            <w:pPr>
-              <w:jc w:val="center"/>
-            </w:pPr>
-            <w:r>
-              <w:rPr>
-                <w:rFonts w:ascii="Poppins SemiBold" w:hAnsi="Poppins SemiBold"/>
-                <w:b w:val="0"/>
-                <w:color w:val="FFFFFF"/>
-                <w:sz w:val="16"/>
-              </w:rPr>
-              <w:t>Unidad</w:t>
-            </w:r>
-          </w:p>
-        </w:tc>
-        <w:tc>
-          <w:tcPr>
-            <w:tcW w:type="dxa" w:w="2948"/>
+            <w:tcW w:type="dxa" w:w="3061"/>
             <w:shd w:val="clear" w:color="auto" w:fill="0F4C9D"/>
             <w:vAlign w:val="center"/>
           </w:tcPr>
@@ -802,7 +625,7 @@
         </w:tc>
         <w:tc>
           <w:tcPr>
-            <w:tcW w:type="dxa" w:w="4649"/>
+            <w:tcW w:type="dxa" w:w="5443"/>
             <w:vAlign w:val="center"/>
           </w:tcPr>
           <w:p>
@@ -813,7 +636,7 @@
         </w:tc>
         <w:tc>
           <w:tcPr>
-            <w:tcW w:type="dxa" w:w="1020"/>
+            <w:tcW w:type="dxa" w:w="1134"/>
             <w:vAlign w:val="center"/>
           </w:tcPr>
           <w:p>
@@ -824,18 +647,7 @@
         </w:tc>
         <w:tc>
           <w:tcPr>
-            <w:tcW w:type="dxa" w:w="1020"/>
-            <w:vAlign w:val="center"/>
-          </w:tcPr>
-          <w:p>
-            <w:pPr>
-              <w:jc w:val="center"/>
-            </w:pPr>
-          </w:p>
-        </w:tc>
-        <w:tc>
-          <w:tcPr>
-            <w:tcW w:type="dxa" w:w="2948"/>
+            <w:tcW w:type="dxa" w:w="3061"/>
             <w:vAlign w:val="center"/>
           </w:tcPr>
           <w:p>
@@ -872,7 +684,7 @@
         </w:tc>
         <w:tc>
           <w:tcPr>
-            <w:tcW w:type="dxa" w:w="4649"/>
+            <w:tcW w:type="dxa" w:w="5443"/>
             <w:vAlign w:val="center"/>
             <w:shd w:val="clear" w:color="auto" w:fill="F7F9FC"/>
           </w:tcPr>
@@ -884,7 +696,7 @@
         </w:tc>
         <w:tc>
           <w:tcPr>
-            <w:tcW w:type="dxa" w:w="1020"/>
+            <w:tcW w:type="dxa" w:w="1134"/>
             <w:vAlign w:val="center"/>
             <w:shd w:val="clear" w:color="auto" w:fill="F7F9FC"/>
           </w:tcPr>
@@ -896,19 +708,7 @@
         </w:tc>
         <w:tc>
           <w:tcPr>
-            <w:tcW w:type="dxa" w:w="1020"/>
-            <w:vAlign w:val="center"/>
-            <w:shd w:val="clear" w:color="auto" w:fill="F7F9FC"/>
-          </w:tcPr>
-          <w:p>
-            <w:pPr>
-              <w:jc w:val="center"/>
-            </w:pPr>
-          </w:p>
-        </w:tc>
-        <w:tc>
-          <w:tcPr>
-            <w:tcW w:type="dxa" w:w="2948"/>
+            <w:tcW w:type="dxa" w:w="3061"/>
             <w:vAlign w:val="center"/>
             <w:shd w:val="clear" w:color="auto" w:fill="F7F9FC"/>
           </w:tcPr>
@@ -945,7 +745,7 @@
         </w:tc>
         <w:tc>
           <w:tcPr>
-            <w:tcW w:type="dxa" w:w="4649"/>
+            <w:tcW w:type="dxa" w:w="5443"/>
             <w:vAlign w:val="center"/>
           </w:tcPr>
           <w:p>
@@ -956,7 +756,7 @@
         </w:tc>
         <w:tc>
           <w:tcPr>
-            <w:tcW w:type="dxa" w:w="1020"/>
+            <w:tcW w:type="dxa" w:w="1134"/>
             <w:vAlign w:val="center"/>
           </w:tcPr>
           <w:p>
@@ -967,18 +767,7 @@
         </w:tc>
         <w:tc>
           <w:tcPr>
-            <w:tcW w:type="dxa" w:w="1020"/>
-            <w:vAlign w:val="center"/>
-          </w:tcPr>
-          <w:p>
-            <w:pPr>
-              <w:jc w:val="center"/>
-            </w:pPr>
-          </w:p>
-        </w:tc>
-        <w:tc>
-          <w:tcPr>
-            <w:tcW w:type="dxa" w:w="2948"/>
+            <w:tcW w:type="dxa" w:w="3061"/>
             <w:vAlign w:val="center"/>
           </w:tcPr>
           <w:p>
@@ -1015,7 +804,7 @@
         </w:tc>
         <w:tc>
           <w:tcPr>
-            <w:tcW w:type="dxa" w:w="4649"/>
+            <w:tcW w:type="dxa" w:w="5443"/>
             <w:vAlign w:val="center"/>
             <w:shd w:val="clear" w:color="auto" w:fill="F7F9FC"/>
           </w:tcPr>
@@ -1027,7 +816,7 @@
         </w:tc>
         <w:tc>
           <w:tcPr>
-            <w:tcW w:type="dxa" w:w="1020"/>
+            <w:tcW w:type="dxa" w:w="1134"/>
             <w:vAlign w:val="center"/>
             <w:shd w:val="clear" w:color="auto" w:fill="F7F9FC"/>
           </w:tcPr>
@@ -1039,19 +828,7 @@
         </w:tc>
         <w:tc>
           <w:tcPr>
-            <w:tcW w:type="dxa" w:w="1020"/>
-            <w:vAlign w:val="center"/>
-            <w:shd w:val="clear" w:color="auto" w:fill="F7F9FC"/>
-          </w:tcPr>
-          <w:p>
-            <w:pPr>
-              <w:jc w:val="center"/>
-            </w:pPr>
-          </w:p>
-        </w:tc>
-        <w:tc>
-          <w:tcPr>
-            <w:tcW w:type="dxa" w:w="2948"/>
+            <w:tcW w:type="dxa" w:w="3061"/>
             <w:vAlign w:val="center"/>
             <w:shd w:val="clear" w:color="auto" w:fill="F7F9FC"/>
           </w:tcPr>
@@ -1088,7 +865,7 @@
         </w:tc>
         <w:tc>
           <w:tcPr>
-            <w:tcW w:type="dxa" w:w="4649"/>
+            <w:tcW w:type="dxa" w:w="5443"/>
             <w:vAlign w:val="center"/>
           </w:tcPr>
           <w:p>
@@ -1099,7 +876,7 @@
         </w:tc>
         <w:tc>
           <w:tcPr>
-            <w:tcW w:type="dxa" w:w="1020"/>
+            <w:tcW w:type="dxa" w:w="1134"/>
             <w:vAlign w:val="center"/>
           </w:tcPr>
           <w:p>
@@ -1110,18 +887,7 @@
         </w:tc>
         <w:tc>
           <w:tcPr>
-            <w:tcW w:type="dxa" w:w="1020"/>
-            <w:vAlign w:val="center"/>
-          </w:tcPr>
-          <w:p>
-            <w:pPr>
-              <w:jc w:val="center"/>
-            </w:pPr>
-          </w:p>
-        </w:tc>
-        <w:tc>
-          <w:tcPr>
-            <w:tcW w:type="dxa" w:w="2948"/>
+            <w:tcW w:type="dxa" w:w="3061"/>
             <w:vAlign w:val="center"/>
           </w:tcPr>
           <w:p>
@@ -1158,7 +924,7 @@
         </w:tc>
         <w:tc>
           <w:tcPr>
-            <w:tcW w:type="dxa" w:w="4649"/>
+            <w:tcW w:type="dxa" w:w="5443"/>
             <w:vAlign w:val="center"/>
             <w:shd w:val="clear" w:color="auto" w:fill="F7F9FC"/>
           </w:tcPr>
@@ -1170,7 +936,7 @@
         </w:tc>
         <w:tc>
           <w:tcPr>
-            <w:tcW w:type="dxa" w:w="1020"/>
+            <w:tcW w:type="dxa" w:w="1134"/>
             <w:vAlign w:val="center"/>
             <w:shd w:val="clear" w:color="auto" w:fill="F7F9FC"/>
           </w:tcPr>
@@ -1182,162 +948,7 @@
         </w:tc>
         <w:tc>
           <w:tcPr>
-            <w:tcW w:type="dxa" w:w="1020"/>
-            <w:vAlign w:val="center"/>
-            <w:shd w:val="clear" w:color="auto" w:fill="F7F9FC"/>
-          </w:tcPr>
-          <w:p>
-            <w:pPr>
-              <w:jc w:val="center"/>
-            </w:pPr>
-          </w:p>
-        </w:tc>
-        <w:tc>
-          <w:tcPr>
-            <w:tcW w:type="dxa" w:w="2948"/>
-            <w:vAlign w:val="center"/>
-            <w:shd w:val="clear" w:color="auto" w:fill="F7F9FC"/>
-          </w:tcPr>
-          <w:p>
-            <w:pPr>
-              <w:jc w:val="left"/>
-            </w:pPr>
-          </w:p>
-        </w:tc>
-      </w:tr>
-      <w:tr>
-        <w:trPr>
-          <w:trHeight w:val="351" w:hRule="atLeast"/>
-        </w:trPr>
-        <w:tc>
-          <w:tcPr>
-            <w:tcW w:type="dxa" w:w="567"/>
-            <w:vAlign w:val="center"/>
-          </w:tcPr>
-          <w:p>
-            <w:pPr>
-              <w:jc w:val="center"/>
-            </w:pPr>
-            <w:r>
-              <w:rPr>
-                <w:rFonts w:ascii="Poppins" w:hAnsi="Poppins"/>
-                <w:b w:val="0"/>
-                <w:color w:val="5B6475"/>
-                <w:sz w:val="16"/>
-              </w:rPr>
-              <w:t>7</w:t>
-            </w:r>
-          </w:p>
-        </w:tc>
-        <w:tc>
-          <w:tcPr>
-            <w:tcW w:type="dxa" w:w="4649"/>
-            <w:vAlign w:val="center"/>
-          </w:tcPr>
-          <w:p>
-            <w:pPr>
-              <w:jc w:val="left"/>
-            </w:pPr>
-          </w:p>
-        </w:tc>
-        <w:tc>
-          <w:tcPr>
-            <w:tcW w:type="dxa" w:w="1020"/>
-            <w:vAlign w:val="center"/>
-          </w:tcPr>
-          <w:p>
-            <w:pPr>
-              <w:jc w:val="center"/>
-            </w:pPr>
-          </w:p>
-        </w:tc>
-        <w:tc>
-          <w:tcPr>
-            <w:tcW w:type="dxa" w:w="1020"/>
-            <w:vAlign w:val="center"/>
-          </w:tcPr>
-          <w:p>
-            <w:pPr>
-              <w:jc w:val="center"/>
-            </w:pPr>
-          </w:p>
-        </w:tc>
-        <w:tc>
-          <w:tcPr>
-            <w:tcW w:type="dxa" w:w="2948"/>
-            <w:vAlign w:val="center"/>
-          </w:tcPr>
-          <w:p>
-            <w:pPr>
-              <w:jc w:val="left"/>
-            </w:pPr>
-          </w:p>
-        </w:tc>
-      </w:tr>
-      <w:tr>
-        <w:trPr>
-          <w:trHeight w:val="351" w:hRule="atLeast"/>
-        </w:trPr>
-        <w:tc>
-          <w:tcPr>
-            <w:tcW w:type="dxa" w:w="567"/>
-            <w:vAlign w:val="center"/>
-            <w:shd w:val="clear" w:color="auto" w:fill="F7F9FC"/>
-          </w:tcPr>
-          <w:p>
-            <w:pPr>
-              <w:jc w:val="center"/>
-            </w:pPr>
-            <w:r>
-              <w:rPr>
-                <w:rFonts w:ascii="Poppins" w:hAnsi="Poppins"/>
-                <w:b w:val="0"/>
-                <w:color w:val="5B6475"/>
-                <w:sz w:val="16"/>
-              </w:rPr>
-              <w:t>8</w:t>
-            </w:r>
-          </w:p>
-        </w:tc>
-        <w:tc>
-          <w:tcPr>
-            <w:tcW w:type="dxa" w:w="4649"/>
-            <w:vAlign w:val="center"/>
-            <w:shd w:val="clear" w:color="auto" w:fill="F7F9FC"/>
-          </w:tcPr>
-          <w:p>
-            <w:pPr>
-              <w:jc w:val="left"/>
-            </w:pPr>
-          </w:p>
-        </w:tc>
-        <w:tc>
-          <w:tcPr>
-            <w:tcW w:type="dxa" w:w="1020"/>
-            <w:vAlign w:val="center"/>
-            <w:shd w:val="clear" w:color="auto" w:fill="F7F9FC"/>
-          </w:tcPr>
-          <w:p>
-            <w:pPr>
-              <w:jc w:val="center"/>
-            </w:pPr>
-          </w:p>
-        </w:tc>
-        <w:tc>
-          <w:tcPr>
-            <w:tcW w:type="dxa" w:w="1020"/>
-            <w:vAlign w:val="center"/>
-            <w:shd w:val="clear" w:color="auto" w:fill="F7F9FC"/>
-          </w:tcPr>
-          <w:p>
-            <w:pPr>
-              <w:jc w:val="center"/>
-            </w:pPr>
-          </w:p>
-        </w:tc>
-        <w:tc>
-          <w:tcPr>
-            <w:tcW w:type="dxa" w:w="2948"/>
+            <w:tcW w:type="dxa" w:w="3061"/>
             <w:vAlign w:val="center"/>
             <w:shd w:val="clear" w:color="auto" w:fill="F7F9FC"/>
           </w:tcPr>
@@ -1351,7 +962,7 @@
     </w:tbl>
     <w:p>
       <w:pPr>
-        <w:spacing w:before="0" w:after="0" w:line="140" w:lineRule="exact"/>
+        <w:spacing w:before="0" w:after="0" w:line="180" w:lineRule="exact"/>
       </w:pPr>
     </w:p>
     <w:tbl>
@@ -1394,6 +1005,7 @@
           </w:tcPr>
           <w:p>
             <w:pPr>
+              <w:keepNext/>
               <w:jc w:val="center"/>
             </w:pPr>
             <w:r>
@@ -1417,1353 +1029,7 @@
           </w:tcPr>
           <w:p>
             <w:pPr>
-              <w:jc w:val="left"/>
-            </w:pPr>
-            <w:r>
-              <w:rPr>
-                <w:rFonts w:ascii="Poppins SemiBold" w:hAnsi="Poppins SemiBold"/>
-                <w:b w:val="0"/>
-                <w:color w:val="0F4C9D"/>
-                <w:sz w:val="20"/>
-              </w:rPr>
-              <w:t xml:space="preserve">  VERIFICACIÓN DE LA ENTREGA</w:t>
-            </w:r>
-          </w:p>
-        </w:tc>
-      </w:tr>
-    </w:tbl>
-    <w:p>
-      <w:pPr>
-        <w:spacing w:before="0" w:after="0" w:line="80" w:lineRule="exact"/>
-      </w:pPr>
-    </w:p>
-    <w:tbl>
-      <w:tblPr>
-        <w:tblLook w:firstColumn="1" w:firstRow="1" w:lastColumn="0" w:lastRow="0" w:noHBand="0" w:noVBand="1" w:val="04A0"/>
-        <w:tblLayout w:type="fixed"/>
-        <w:tblCellMar>
-          <w:top w:w="20" w:type="dxa"/>
-          <w:left w:w="80" w:type="dxa"/>
-          <w:bottom w:w="20" w:type="dxa"/>
-          <w:right w:w="80" w:type="dxa"/>
-        </w:tblCellMar>
-        <w:tblBorders>
-          <w:top w:val="single" w:sz="4" w:space="0" w:color="C9D5E8"/>
-          <w:left w:val="single" w:sz="4" w:space="0" w:color="C9D5E8"/>
-          <w:bottom w:val="single" w:sz="4" w:space="0" w:color="C9D5E8"/>
-          <w:right w:val="single" w:sz="4" w:space="0" w:color="C9D5E8"/>
-          <w:insideH w:val="single" w:sz="4" w:space="0" w:color="C9D5E8"/>
-          <w:insideV w:val="single" w:sz="4" w:space="0" w:color="C9D5E8"/>
-        </w:tblBorders>
-        <w:tblLayout w:type="fixed"/>
-        <w:tblW w:w="10206" w:type="dxa"/>
-      </w:tblPr>
-      <w:tblGrid>
-        <w:gridCol w:w="5216"/>
-        <w:gridCol w:w="623"/>
-        <w:gridCol w:w="623"/>
-        <w:gridCol w:w="623"/>
-        <w:gridCol w:w="3118"/>
-      </w:tblGrid>
-      <w:tr>
-        <w:trPr>
-          <w:trHeight w:val="397" w:hRule="atLeast"/>
-        </w:trPr>
-        <w:tc>
-          <w:tcPr>
-            <w:tcW w:type="dxa" w:w="5216"/>
-            <w:shd w:val="clear" w:color="auto" w:fill="0F4C9D"/>
-            <w:vAlign w:val="center"/>
-          </w:tcPr>
-          <w:p>
-            <w:pPr>
-              <w:jc w:val="left"/>
-            </w:pPr>
-            <w:r>
-              <w:rPr>
-                <w:rFonts w:ascii="Poppins SemiBold" w:hAnsi="Poppins SemiBold"/>
-                <w:b w:val="0"/>
-                <w:color w:val="FFFFFF"/>
-                <w:sz w:val="16"/>
-              </w:rPr>
-              <w:t>Punto verificado</w:t>
-            </w:r>
-          </w:p>
-        </w:tc>
-        <w:tc>
-          <w:tcPr>
-            <w:tcW w:type="dxa" w:w="624"/>
-            <w:shd w:val="clear" w:color="auto" w:fill="0F4C9D"/>
-            <w:vAlign w:val="center"/>
-          </w:tcPr>
-          <w:p>
-            <w:pPr>
-              <w:jc w:val="center"/>
-            </w:pPr>
-            <w:r>
-              <w:rPr>
-                <w:rFonts w:ascii="Poppins SemiBold" w:hAnsi="Poppins SemiBold"/>
-                <w:b w:val="0"/>
-                <w:color w:val="FFFFFF"/>
-                <w:sz w:val="16"/>
-              </w:rPr>
-              <w:t>Sí</w:t>
-            </w:r>
-          </w:p>
-        </w:tc>
-        <w:tc>
-          <w:tcPr>
-            <w:tcW w:type="dxa" w:w="624"/>
-            <w:shd w:val="clear" w:color="auto" w:fill="0F4C9D"/>
-            <w:vAlign w:val="center"/>
-          </w:tcPr>
-          <w:p>
-            <w:pPr>
-              <w:jc w:val="center"/>
-            </w:pPr>
-            <w:r>
-              <w:rPr>
-                <w:rFonts w:ascii="Poppins SemiBold" w:hAnsi="Poppins SemiBold"/>
-                <w:b w:val="0"/>
-                <w:color w:val="FFFFFF"/>
-                <w:sz w:val="16"/>
-              </w:rPr>
-              <w:t>No</w:t>
-            </w:r>
-          </w:p>
-        </w:tc>
-        <w:tc>
-          <w:tcPr>
-            <w:tcW w:type="dxa" w:w="624"/>
-            <w:shd w:val="clear" w:color="auto" w:fill="0F4C9D"/>
-            <w:vAlign w:val="center"/>
-          </w:tcPr>
-          <w:p>
-            <w:pPr>
-              <w:jc w:val="center"/>
-            </w:pPr>
-            <w:r>
-              <w:rPr>
-                <w:rFonts w:ascii="Poppins SemiBold" w:hAnsi="Poppins SemiBold"/>
-                <w:b w:val="0"/>
-                <w:color w:val="FFFFFF"/>
-                <w:sz w:val="16"/>
-              </w:rPr>
-              <w:t>N/A</w:t>
-            </w:r>
-          </w:p>
-        </w:tc>
-        <w:tc>
-          <w:tcPr>
-            <w:tcW w:type="dxa" w:w="3118"/>
-            <w:shd w:val="clear" w:color="auto" w:fill="0F4C9D"/>
-            <w:vAlign w:val="center"/>
-          </w:tcPr>
-          <w:p>
-            <w:pPr>
-              <w:jc w:val="center"/>
-            </w:pPr>
-            <w:r>
-              <w:rPr>
-                <w:rFonts w:ascii="Poppins SemiBold" w:hAnsi="Poppins SemiBold"/>
-                <w:b w:val="0"/>
-                <w:color w:val="FFFFFF"/>
-                <w:sz w:val="16"/>
-              </w:rPr>
-              <w:t>Observación</w:t>
-            </w:r>
-          </w:p>
-        </w:tc>
-      </w:tr>
-      <w:tr>
-        <w:trPr>
-          <w:trHeight w:val="397" w:hRule="atLeast"/>
-        </w:trPr>
-        <w:tc>
-          <w:tcPr>
-            <w:tcW w:type="dxa" w:w="5216"/>
-            <w:vAlign w:val="center"/>
-          </w:tcPr>
-          <w:p>
-            <w:pPr>
-              <w:jc w:val="left"/>
-            </w:pPr>
-            <w:r>
-              <w:rPr>
-                <w:rFonts w:ascii="Poppins" w:hAnsi="Poppins"/>
-                <w:b w:val="0"/>
-                <w:color w:val="1E2633"/>
-                <w:sz w:val="16"/>
-              </w:rPr>
-              <w:t>Instalación conforme a planos, proforma o especificaciones aprobadas</w:t>
-            </w:r>
-          </w:p>
-        </w:tc>
-        <w:tc>
-          <w:tcPr>
-            <w:tcW w:type="dxa" w:w="624"/>
-            <w:vAlign w:val="center"/>
-          </w:tcPr>
-          <w:p>
-            <w:pPr>
-              <w:jc w:val="center"/>
-            </w:pPr>
-            <w:sdt>
-              <w:sdtPr>
-                <w:rPr>
-                  <w:rFonts w:ascii="Segoe UI Symbol" w:hAnsi="Segoe UI Symbol"/>
-                  <w:color w:val="0F4C9D"/>
-                  <w:sz w:val="22"/>
-                </w:rPr>
-                <w14:checkbox>
-                  <w14:checked w14:val="0"/>
-                  <w14:checkedState w14:val="2612" w14:font="Segoe UI Symbol"/>
-                  <w14:uncheckedState w14:val="2610" w14:font="Segoe UI Symbol"/>
-                </w14:checkbox>
-              </w:sdtPr>
-              <w:sdtContent>
-                <w:r>
-                  <w:rPr>
-                    <w:rFonts w:ascii="Segoe UI Symbol" w:hAnsi="Segoe UI Symbol"/>
-                    <w:color w:val="0F4C9D"/>
-                    <w:sz w:val="22"/>
-                  </w:rPr>
-                  <w:t>☐</w:t>
-                </w:r>
-              </w:sdtContent>
-            </w:sdt>
-          </w:p>
-        </w:tc>
-        <w:tc>
-          <w:tcPr>
-            <w:tcW w:type="dxa" w:w="624"/>
-            <w:vAlign w:val="center"/>
-          </w:tcPr>
-          <w:p>
-            <w:pPr>
-              <w:jc w:val="center"/>
-            </w:pPr>
-            <w:sdt>
-              <w:sdtPr>
-                <w:rPr>
-                  <w:rFonts w:ascii="Segoe UI Symbol" w:hAnsi="Segoe UI Symbol"/>
-                  <w:color w:val="0F4C9D"/>
-                  <w:sz w:val="22"/>
-                </w:rPr>
-                <w14:checkbox>
-                  <w14:checked w14:val="0"/>
-                  <w14:checkedState w14:val="2612" w14:font="Segoe UI Symbol"/>
-                  <w14:uncheckedState w14:val="2610" w14:font="Segoe UI Symbol"/>
-                </w14:checkbox>
-              </w:sdtPr>
-              <w:sdtContent>
-                <w:r>
-                  <w:rPr>
-                    <w:rFonts w:ascii="Segoe UI Symbol" w:hAnsi="Segoe UI Symbol"/>
-                    <w:color w:val="0F4C9D"/>
-                    <w:sz w:val="22"/>
-                  </w:rPr>
-                  <w:t>☐</w:t>
-                </w:r>
-              </w:sdtContent>
-            </w:sdt>
-          </w:p>
-        </w:tc>
-        <w:tc>
-          <w:tcPr>
-            <w:tcW w:type="dxa" w:w="624"/>
-            <w:vAlign w:val="center"/>
-          </w:tcPr>
-          <w:p>
-            <w:pPr>
-              <w:jc w:val="center"/>
-            </w:pPr>
-            <w:sdt>
-              <w:sdtPr>
-                <w:rPr>
-                  <w:rFonts w:ascii="Segoe UI Symbol" w:hAnsi="Segoe UI Symbol"/>
-                  <w:color w:val="0F4C9D"/>
-                  <w:sz w:val="22"/>
-                </w:rPr>
-                <w14:checkbox>
-                  <w14:checked w14:val="0"/>
-                  <w14:checkedState w14:val="2612" w14:font="Segoe UI Symbol"/>
-                  <w14:uncheckedState w14:val="2610" w14:font="Segoe UI Symbol"/>
-                </w14:checkbox>
-              </w:sdtPr>
-              <w:sdtContent>
-                <w:r>
-                  <w:rPr>
-                    <w:rFonts w:ascii="Segoe UI Symbol" w:hAnsi="Segoe UI Symbol"/>
-                    <w:color w:val="0F4C9D"/>
-                    <w:sz w:val="22"/>
-                  </w:rPr>
-                  <w:t>☐</w:t>
-                </w:r>
-              </w:sdtContent>
-            </w:sdt>
-          </w:p>
-        </w:tc>
-        <w:tc>
-          <w:tcPr>
-            <w:tcW w:type="dxa" w:w="3118"/>
-            <w:vAlign w:val="center"/>
-          </w:tcPr>
-          <w:p>
-            <w:pPr>
-              <w:jc w:val="left"/>
-            </w:pPr>
-          </w:p>
-        </w:tc>
-      </w:tr>
-      <w:tr>
-        <w:trPr>
-          <w:trHeight w:val="397" w:hRule="atLeast"/>
-        </w:trPr>
-        <w:tc>
-          <w:tcPr>
-            <w:tcW w:type="dxa" w:w="5216"/>
-            <w:vAlign w:val="center"/>
-            <w:shd w:val="clear" w:color="auto" w:fill="F7F9FC"/>
-          </w:tcPr>
-          <w:p>
-            <w:pPr>
-              <w:jc w:val="left"/>
-            </w:pPr>
-            <w:r>
-              <w:rPr>
-                <w:rFonts w:ascii="Poppins" w:hAnsi="Poppins"/>
-                <w:b w:val="0"/>
-                <w:color w:val="1E2633"/>
-                <w:sz w:val="16"/>
-              </w:rPr>
-              <w:t>Estructura nivelada, aplomada y anclada al piso</w:t>
-            </w:r>
-          </w:p>
-        </w:tc>
-        <w:tc>
-          <w:tcPr>
-            <w:tcW w:type="dxa" w:w="624"/>
-            <w:vAlign w:val="center"/>
-            <w:shd w:val="clear" w:color="auto" w:fill="F7F9FC"/>
-          </w:tcPr>
-          <w:p>
-            <w:pPr>
-              <w:jc w:val="center"/>
-            </w:pPr>
-            <w:sdt>
-              <w:sdtPr>
-                <w:rPr>
-                  <w:rFonts w:ascii="Segoe UI Symbol" w:hAnsi="Segoe UI Symbol"/>
-                  <w:color w:val="0F4C9D"/>
-                  <w:sz w:val="22"/>
-                </w:rPr>
-                <w14:checkbox>
-                  <w14:checked w14:val="0"/>
-                  <w14:checkedState w14:val="2612" w14:font="Segoe UI Symbol"/>
-                  <w14:uncheckedState w14:val="2610" w14:font="Segoe UI Symbol"/>
-                </w14:checkbox>
-              </w:sdtPr>
-              <w:sdtContent>
-                <w:r>
-                  <w:rPr>
-                    <w:rFonts w:ascii="Segoe UI Symbol" w:hAnsi="Segoe UI Symbol"/>
-                    <w:color w:val="0F4C9D"/>
-                    <w:sz w:val="22"/>
-                  </w:rPr>
-                  <w:t>☐</w:t>
-                </w:r>
-              </w:sdtContent>
-            </w:sdt>
-          </w:p>
-        </w:tc>
-        <w:tc>
-          <w:tcPr>
-            <w:tcW w:type="dxa" w:w="624"/>
-            <w:vAlign w:val="center"/>
-            <w:shd w:val="clear" w:color="auto" w:fill="F7F9FC"/>
-          </w:tcPr>
-          <w:p>
-            <w:pPr>
-              <w:jc w:val="center"/>
-            </w:pPr>
-            <w:sdt>
-              <w:sdtPr>
-                <w:rPr>
-                  <w:rFonts w:ascii="Segoe UI Symbol" w:hAnsi="Segoe UI Symbol"/>
-                  <w:color w:val="0F4C9D"/>
-                  <w:sz w:val="22"/>
-                </w:rPr>
-                <w14:checkbox>
-                  <w14:checked w14:val="0"/>
-                  <w14:checkedState w14:val="2612" w14:font="Segoe UI Symbol"/>
-                  <w14:uncheckedState w14:val="2610" w14:font="Segoe UI Symbol"/>
-                </w14:checkbox>
-              </w:sdtPr>
-              <w:sdtContent>
-                <w:r>
-                  <w:rPr>
-                    <w:rFonts w:ascii="Segoe UI Symbol" w:hAnsi="Segoe UI Symbol"/>
-                    <w:color w:val="0F4C9D"/>
-                    <w:sz w:val="22"/>
-                  </w:rPr>
-                  <w:t>☐</w:t>
-                </w:r>
-              </w:sdtContent>
-            </w:sdt>
-          </w:p>
-        </w:tc>
-        <w:tc>
-          <w:tcPr>
-            <w:tcW w:type="dxa" w:w="624"/>
-            <w:vAlign w:val="center"/>
-            <w:shd w:val="clear" w:color="auto" w:fill="F7F9FC"/>
-          </w:tcPr>
-          <w:p>
-            <w:pPr>
-              <w:jc w:val="center"/>
-            </w:pPr>
-            <w:sdt>
-              <w:sdtPr>
-                <w:rPr>
-                  <w:rFonts w:ascii="Segoe UI Symbol" w:hAnsi="Segoe UI Symbol"/>
-                  <w:color w:val="0F4C9D"/>
-                  <w:sz w:val="22"/>
-                </w:rPr>
-                <w14:checkbox>
-                  <w14:checked w14:val="0"/>
-                  <w14:checkedState w14:val="2612" w14:font="Segoe UI Symbol"/>
-                  <w14:uncheckedState w14:val="2610" w14:font="Segoe UI Symbol"/>
-                </w14:checkbox>
-              </w:sdtPr>
-              <w:sdtContent>
-                <w:r>
-                  <w:rPr>
-                    <w:rFonts w:ascii="Segoe UI Symbol" w:hAnsi="Segoe UI Symbol"/>
-                    <w:color w:val="0F4C9D"/>
-                    <w:sz w:val="22"/>
-                  </w:rPr>
-                  <w:t>☐</w:t>
-                </w:r>
-              </w:sdtContent>
-            </w:sdt>
-          </w:p>
-        </w:tc>
-        <w:tc>
-          <w:tcPr>
-            <w:tcW w:type="dxa" w:w="3118"/>
-            <w:vAlign w:val="center"/>
-            <w:shd w:val="clear" w:color="auto" w:fill="F7F9FC"/>
-          </w:tcPr>
-          <w:p>
-            <w:pPr>
-              <w:jc w:val="left"/>
-            </w:pPr>
-          </w:p>
-        </w:tc>
-      </w:tr>
-      <w:tr>
-        <w:trPr>
-          <w:trHeight w:val="397" w:hRule="atLeast"/>
-        </w:trPr>
-        <w:tc>
-          <w:tcPr>
-            <w:tcW w:type="dxa" w:w="5216"/>
-            <w:vAlign w:val="center"/>
-          </w:tcPr>
-          <w:p>
-            <w:pPr>
-              <w:jc w:val="left"/>
-            </w:pPr>
-            <w:r>
-              <w:rPr>
-                <w:rFonts w:ascii="Poppins" w:hAnsi="Poppins"/>
-                <w:b w:val="0"/>
-                <w:color w:val="1E2633"/>
-                <w:sz w:val="16"/>
-              </w:rPr>
-              <w:t>Accesorios de seguridad instalados (seguros de viga, protectores, mallas)</w:t>
-            </w:r>
-          </w:p>
-        </w:tc>
-        <w:tc>
-          <w:tcPr>
-            <w:tcW w:type="dxa" w:w="624"/>
-            <w:vAlign w:val="center"/>
-          </w:tcPr>
-          <w:p>
-            <w:pPr>
-              <w:jc w:val="center"/>
-            </w:pPr>
-            <w:sdt>
-              <w:sdtPr>
-                <w:rPr>
-                  <w:rFonts w:ascii="Segoe UI Symbol" w:hAnsi="Segoe UI Symbol"/>
-                  <w:color w:val="0F4C9D"/>
-                  <w:sz w:val="22"/>
-                </w:rPr>
-                <w14:checkbox>
-                  <w14:checked w14:val="0"/>
-                  <w14:checkedState w14:val="2612" w14:font="Segoe UI Symbol"/>
-                  <w14:uncheckedState w14:val="2610" w14:font="Segoe UI Symbol"/>
-                </w14:checkbox>
-              </w:sdtPr>
-              <w:sdtContent>
-                <w:r>
-                  <w:rPr>
-                    <w:rFonts w:ascii="Segoe UI Symbol" w:hAnsi="Segoe UI Symbol"/>
-                    <w:color w:val="0F4C9D"/>
-                    <w:sz w:val="22"/>
-                  </w:rPr>
-                  <w:t>☐</w:t>
-                </w:r>
-              </w:sdtContent>
-            </w:sdt>
-          </w:p>
-        </w:tc>
-        <w:tc>
-          <w:tcPr>
-            <w:tcW w:type="dxa" w:w="624"/>
-            <w:vAlign w:val="center"/>
-          </w:tcPr>
-          <w:p>
-            <w:pPr>
-              <w:jc w:val="center"/>
-            </w:pPr>
-            <w:sdt>
-              <w:sdtPr>
-                <w:rPr>
-                  <w:rFonts w:ascii="Segoe UI Symbol" w:hAnsi="Segoe UI Symbol"/>
-                  <w:color w:val="0F4C9D"/>
-                  <w:sz w:val="22"/>
-                </w:rPr>
-                <w14:checkbox>
-                  <w14:checked w14:val="0"/>
-                  <w14:checkedState w14:val="2612" w14:font="Segoe UI Symbol"/>
-                  <w14:uncheckedState w14:val="2610" w14:font="Segoe UI Symbol"/>
-                </w14:checkbox>
-              </w:sdtPr>
-              <w:sdtContent>
-                <w:r>
-                  <w:rPr>
-                    <w:rFonts w:ascii="Segoe UI Symbol" w:hAnsi="Segoe UI Symbol"/>
-                    <w:color w:val="0F4C9D"/>
-                    <w:sz w:val="22"/>
-                  </w:rPr>
-                  <w:t>☐</w:t>
-                </w:r>
-              </w:sdtContent>
-            </w:sdt>
-          </w:p>
-        </w:tc>
-        <w:tc>
-          <w:tcPr>
-            <w:tcW w:type="dxa" w:w="624"/>
-            <w:vAlign w:val="center"/>
-          </w:tcPr>
-          <w:p>
-            <w:pPr>
-              <w:jc w:val="center"/>
-            </w:pPr>
-            <w:sdt>
-              <w:sdtPr>
-                <w:rPr>
-                  <w:rFonts w:ascii="Segoe UI Symbol" w:hAnsi="Segoe UI Symbol"/>
-                  <w:color w:val="0F4C9D"/>
-                  <w:sz w:val="22"/>
-                </w:rPr>
-                <w14:checkbox>
-                  <w14:checked w14:val="0"/>
-                  <w14:checkedState w14:val="2612" w14:font="Segoe UI Symbol"/>
-                  <w14:uncheckedState w14:val="2610" w14:font="Segoe UI Symbol"/>
-                </w14:checkbox>
-              </w:sdtPr>
-              <w:sdtContent>
-                <w:r>
-                  <w:rPr>
-                    <w:rFonts w:ascii="Segoe UI Symbol" w:hAnsi="Segoe UI Symbol"/>
-                    <w:color w:val="0F4C9D"/>
-                    <w:sz w:val="22"/>
-                  </w:rPr>
-                  <w:t>☐</w:t>
-                </w:r>
-              </w:sdtContent>
-            </w:sdt>
-          </w:p>
-        </w:tc>
-        <w:tc>
-          <w:tcPr>
-            <w:tcW w:type="dxa" w:w="3118"/>
-            <w:vAlign w:val="center"/>
-          </w:tcPr>
-          <w:p>
-            <w:pPr>
-              <w:jc w:val="left"/>
-            </w:pPr>
-          </w:p>
-        </w:tc>
-      </w:tr>
-      <w:tr>
-        <w:trPr>
-          <w:trHeight w:val="397" w:hRule="atLeast"/>
-        </w:trPr>
-        <w:tc>
-          <w:tcPr>
-            <w:tcW w:type="dxa" w:w="5216"/>
-            <w:vAlign w:val="center"/>
-            <w:shd w:val="clear" w:color="auto" w:fill="F7F9FC"/>
-          </w:tcPr>
-          <w:p>
-            <w:pPr>
-              <w:jc w:val="left"/>
-            </w:pPr>
-            <w:r>
-              <w:rPr>
-                <w:rFonts w:ascii="Poppins" w:hAnsi="Poppins"/>
-                <w:b w:val="0"/>
-                <w:color w:val="1E2633"/>
-                <w:sz w:val="16"/>
-              </w:rPr>
-              <w:t>Capacidades de carga rotuladas en cada módulo</w:t>
-            </w:r>
-          </w:p>
-        </w:tc>
-        <w:tc>
-          <w:tcPr>
-            <w:tcW w:type="dxa" w:w="624"/>
-            <w:vAlign w:val="center"/>
-            <w:shd w:val="clear" w:color="auto" w:fill="F7F9FC"/>
-          </w:tcPr>
-          <w:p>
-            <w:pPr>
-              <w:jc w:val="center"/>
-            </w:pPr>
-            <w:sdt>
-              <w:sdtPr>
-                <w:rPr>
-                  <w:rFonts w:ascii="Segoe UI Symbol" w:hAnsi="Segoe UI Symbol"/>
-                  <w:color w:val="0F4C9D"/>
-                  <w:sz w:val="22"/>
-                </w:rPr>
-                <w14:checkbox>
-                  <w14:checked w14:val="0"/>
-                  <w14:checkedState w14:val="2612" w14:font="Segoe UI Symbol"/>
-                  <w14:uncheckedState w14:val="2610" w14:font="Segoe UI Symbol"/>
-                </w14:checkbox>
-              </w:sdtPr>
-              <w:sdtContent>
-                <w:r>
-                  <w:rPr>
-                    <w:rFonts w:ascii="Segoe UI Symbol" w:hAnsi="Segoe UI Symbol"/>
-                    <w:color w:val="0F4C9D"/>
-                    <w:sz w:val="22"/>
-                  </w:rPr>
-                  <w:t>☐</w:t>
-                </w:r>
-              </w:sdtContent>
-            </w:sdt>
-          </w:p>
-        </w:tc>
-        <w:tc>
-          <w:tcPr>
-            <w:tcW w:type="dxa" w:w="624"/>
-            <w:vAlign w:val="center"/>
-            <w:shd w:val="clear" w:color="auto" w:fill="F7F9FC"/>
-          </w:tcPr>
-          <w:p>
-            <w:pPr>
-              <w:jc w:val="center"/>
-            </w:pPr>
-            <w:sdt>
-              <w:sdtPr>
-                <w:rPr>
-                  <w:rFonts w:ascii="Segoe UI Symbol" w:hAnsi="Segoe UI Symbol"/>
-                  <w:color w:val="0F4C9D"/>
-                  <w:sz w:val="22"/>
-                </w:rPr>
-                <w14:checkbox>
-                  <w14:checked w14:val="0"/>
-                  <w14:checkedState w14:val="2612" w14:font="Segoe UI Symbol"/>
-                  <w14:uncheckedState w14:val="2610" w14:font="Segoe UI Symbol"/>
-                </w14:checkbox>
-              </w:sdtPr>
-              <w:sdtContent>
-                <w:r>
-                  <w:rPr>
-                    <w:rFonts w:ascii="Segoe UI Symbol" w:hAnsi="Segoe UI Symbol"/>
-                    <w:color w:val="0F4C9D"/>
-                    <w:sz w:val="22"/>
-                  </w:rPr>
-                  <w:t>☐</w:t>
-                </w:r>
-              </w:sdtContent>
-            </w:sdt>
-          </w:p>
-        </w:tc>
-        <w:tc>
-          <w:tcPr>
-            <w:tcW w:type="dxa" w:w="624"/>
-            <w:vAlign w:val="center"/>
-            <w:shd w:val="clear" w:color="auto" w:fill="F7F9FC"/>
-          </w:tcPr>
-          <w:p>
-            <w:pPr>
-              <w:jc w:val="center"/>
-            </w:pPr>
-            <w:sdt>
-              <w:sdtPr>
-                <w:rPr>
-                  <w:rFonts w:ascii="Segoe UI Symbol" w:hAnsi="Segoe UI Symbol"/>
-                  <w:color w:val="0F4C9D"/>
-                  <w:sz w:val="22"/>
-                </w:rPr>
-                <w14:checkbox>
-                  <w14:checked w14:val="0"/>
-                  <w14:checkedState w14:val="2612" w14:font="Segoe UI Symbol"/>
-                  <w14:uncheckedState w14:val="2610" w14:font="Segoe UI Symbol"/>
-                </w14:checkbox>
-              </w:sdtPr>
-              <w:sdtContent>
-                <w:r>
-                  <w:rPr>
-                    <w:rFonts w:ascii="Segoe UI Symbol" w:hAnsi="Segoe UI Symbol"/>
-                    <w:color w:val="0F4C9D"/>
-                    <w:sz w:val="22"/>
-                  </w:rPr>
-                  <w:t>☐</w:t>
-                </w:r>
-              </w:sdtContent>
-            </w:sdt>
-          </w:p>
-        </w:tc>
-        <w:tc>
-          <w:tcPr>
-            <w:tcW w:type="dxa" w:w="3118"/>
-            <w:vAlign w:val="center"/>
-            <w:shd w:val="clear" w:color="auto" w:fill="F7F9FC"/>
-          </w:tcPr>
-          <w:p>
-            <w:pPr>
-              <w:jc w:val="left"/>
-            </w:pPr>
-          </w:p>
-        </w:tc>
-      </w:tr>
-      <w:tr>
-        <w:trPr>
-          <w:trHeight w:val="397" w:hRule="atLeast"/>
-        </w:trPr>
-        <w:tc>
-          <w:tcPr>
-            <w:tcW w:type="dxa" w:w="5216"/>
-            <w:vAlign w:val="center"/>
-          </w:tcPr>
-          <w:p>
-            <w:pPr>
-              <w:jc w:val="left"/>
-            </w:pPr>
-            <w:r>
-              <w:rPr>
-                <w:rFonts w:ascii="Poppins" w:hAnsi="Poppins"/>
-                <w:b w:val="0"/>
-                <w:color w:val="1E2633"/>
-                <w:sz w:val="16"/>
-              </w:rPr>
-              <w:t>Limpieza del área y retiro del material sobrante</w:t>
-            </w:r>
-          </w:p>
-        </w:tc>
-        <w:tc>
-          <w:tcPr>
-            <w:tcW w:type="dxa" w:w="624"/>
-            <w:vAlign w:val="center"/>
-          </w:tcPr>
-          <w:p>
-            <w:pPr>
-              <w:jc w:val="center"/>
-            </w:pPr>
-            <w:sdt>
-              <w:sdtPr>
-                <w:rPr>
-                  <w:rFonts w:ascii="Segoe UI Symbol" w:hAnsi="Segoe UI Symbol"/>
-                  <w:color w:val="0F4C9D"/>
-                  <w:sz w:val="22"/>
-                </w:rPr>
-                <w14:checkbox>
-                  <w14:checked w14:val="0"/>
-                  <w14:checkedState w14:val="2612" w14:font="Segoe UI Symbol"/>
-                  <w14:uncheckedState w14:val="2610" w14:font="Segoe UI Symbol"/>
-                </w14:checkbox>
-              </w:sdtPr>
-              <w:sdtContent>
-                <w:r>
-                  <w:rPr>
-                    <w:rFonts w:ascii="Segoe UI Symbol" w:hAnsi="Segoe UI Symbol"/>
-                    <w:color w:val="0F4C9D"/>
-                    <w:sz w:val="22"/>
-                  </w:rPr>
-                  <w:t>☐</w:t>
-                </w:r>
-              </w:sdtContent>
-            </w:sdt>
-          </w:p>
-        </w:tc>
-        <w:tc>
-          <w:tcPr>
-            <w:tcW w:type="dxa" w:w="624"/>
-            <w:vAlign w:val="center"/>
-          </w:tcPr>
-          <w:p>
-            <w:pPr>
-              <w:jc w:val="center"/>
-            </w:pPr>
-            <w:sdt>
-              <w:sdtPr>
-                <w:rPr>
-                  <w:rFonts w:ascii="Segoe UI Symbol" w:hAnsi="Segoe UI Symbol"/>
-                  <w:color w:val="0F4C9D"/>
-                  <w:sz w:val="22"/>
-                </w:rPr>
-                <w14:checkbox>
-                  <w14:checked w14:val="0"/>
-                  <w14:checkedState w14:val="2612" w14:font="Segoe UI Symbol"/>
-                  <w14:uncheckedState w14:val="2610" w14:font="Segoe UI Symbol"/>
-                </w14:checkbox>
-              </w:sdtPr>
-              <w:sdtContent>
-                <w:r>
-                  <w:rPr>
-                    <w:rFonts w:ascii="Segoe UI Symbol" w:hAnsi="Segoe UI Symbol"/>
-                    <w:color w:val="0F4C9D"/>
-                    <w:sz w:val="22"/>
-                  </w:rPr>
-                  <w:t>☐</w:t>
-                </w:r>
-              </w:sdtContent>
-            </w:sdt>
-          </w:p>
-        </w:tc>
-        <w:tc>
-          <w:tcPr>
-            <w:tcW w:type="dxa" w:w="624"/>
-            <w:vAlign w:val="center"/>
-          </w:tcPr>
-          <w:p>
-            <w:pPr>
-              <w:jc w:val="center"/>
-            </w:pPr>
-            <w:sdt>
-              <w:sdtPr>
-                <w:rPr>
-                  <w:rFonts w:ascii="Segoe UI Symbol" w:hAnsi="Segoe UI Symbol"/>
-                  <w:color w:val="0F4C9D"/>
-                  <w:sz w:val="22"/>
-                </w:rPr>
-                <w14:checkbox>
-                  <w14:checked w14:val="0"/>
-                  <w14:checkedState w14:val="2612" w14:font="Segoe UI Symbol"/>
-                  <w14:uncheckedState w14:val="2610" w14:font="Segoe UI Symbol"/>
-                </w14:checkbox>
-              </w:sdtPr>
-              <w:sdtContent>
-                <w:r>
-                  <w:rPr>
-                    <w:rFonts w:ascii="Segoe UI Symbol" w:hAnsi="Segoe UI Symbol"/>
-                    <w:color w:val="0F4C9D"/>
-                    <w:sz w:val="22"/>
-                  </w:rPr>
-                  <w:t>☐</w:t>
-                </w:r>
-              </w:sdtContent>
-            </w:sdt>
-          </w:p>
-        </w:tc>
-        <w:tc>
-          <w:tcPr>
-            <w:tcW w:type="dxa" w:w="3118"/>
-            <w:vAlign w:val="center"/>
-          </w:tcPr>
-          <w:p>
-            <w:pPr>
-              <w:jc w:val="left"/>
-            </w:pPr>
-          </w:p>
-        </w:tc>
-      </w:tr>
-      <w:tr>
-        <w:trPr>
-          <w:trHeight w:val="397" w:hRule="atLeast"/>
-        </w:trPr>
-        <w:tc>
-          <w:tcPr>
-            <w:tcW w:type="dxa" w:w="5216"/>
-            <w:vAlign w:val="center"/>
-            <w:shd w:val="clear" w:color="auto" w:fill="F7F9FC"/>
-          </w:tcPr>
-          <w:p>
-            <w:pPr>
-              <w:jc w:val="left"/>
-            </w:pPr>
-            <w:r>
-              <w:rPr>
-                <w:rFonts w:ascii="Poppins" w:hAnsi="Poppins"/>
-                <w:b w:val="0"/>
-                <w:color w:val="1E2633"/>
-                <w:sz w:val="16"/>
-              </w:rPr>
-              <w:t>Capacitación al personal sobre uso seguro y límites de carga</w:t>
-            </w:r>
-          </w:p>
-        </w:tc>
-        <w:tc>
-          <w:tcPr>
-            <w:tcW w:type="dxa" w:w="624"/>
-            <w:vAlign w:val="center"/>
-            <w:shd w:val="clear" w:color="auto" w:fill="F7F9FC"/>
-          </w:tcPr>
-          <w:p>
-            <w:pPr>
-              <w:jc w:val="center"/>
-            </w:pPr>
-            <w:sdt>
-              <w:sdtPr>
-                <w:rPr>
-                  <w:rFonts w:ascii="Segoe UI Symbol" w:hAnsi="Segoe UI Symbol"/>
-                  <w:color w:val="0F4C9D"/>
-                  <w:sz w:val="22"/>
-                </w:rPr>
-                <w14:checkbox>
-                  <w14:checked w14:val="0"/>
-                  <w14:checkedState w14:val="2612" w14:font="Segoe UI Symbol"/>
-                  <w14:uncheckedState w14:val="2610" w14:font="Segoe UI Symbol"/>
-                </w14:checkbox>
-              </w:sdtPr>
-              <w:sdtContent>
-                <w:r>
-                  <w:rPr>
-                    <w:rFonts w:ascii="Segoe UI Symbol" w:hAnsi="Segoe UI Symbol"/>
-                    <w:color w:val="0F4C9D"/>
-                    <w:sz w:val="22"/>
-                  </w:rPr>
-                  <w:t>☐</w:t>
-                </w:r>
-              </w:sdtContent>
-            </w:sdt>
-          </w:p>
-        </w:tc>
-        <w:tc>
-          <w:tcPr>
-            <w:tcW w:type="dxa" w:w="624"/>
-            <w:vAlign w:val="center"/>
-            <w:shd w:val="clear" w:color="auto" w:fill="F7F9FC"/>
-          </w:tcPr>
-          <w:p>
-            <w:pPr>
-              <w:jc w:val="center"/>
-            </w:pPr>
-            <w:sdt>
-              <w:sdtPr>
-                <w:rPr>
-                  <w:rFonts w:ascii="Segoe UI Symbol" w:hAnsi="Segoe UI Symbol"/>
-                  <w:color w:val="0F4C9D"/>
-                  <w:sz w:val="22"/>
-                </w:rPr>
-                <w14:checkbox>
-                  <w14:checked w14:val="0"/>
-                  <w14:checkedState w14:val="2612" w14:font="Segoe UI Symbol"/>
-                  <w14:uncheckedState w14:val="2610" w14:font="Segoe UI Symbol"/>
-                </w14:checkbox>
-              </w:sdtPr>
-              <w:sdtContent>
-                <w:r>
-                  <w:rPr>
-                    <w:rFonts w:ascii="Segoe UI Symbol" w:hAnsi="Segoe UI Symbol"/>
-                    <w:color w:val="0F4C9D"/>
-                    <w:sz w:val="22"/>
-                  </w:rPr>
-                  <w:t>☐</w:t>
-                </w:r>
-              </w:sdtContent>
-            </w:sdt>
-          </w:p>
-        </w:tc>
-        <w:tc>
-          <w:tcPr>
-            <w:tcW w:type="dxa" w:w="624"/>
-            <w:vAlign w:val="center"/>
-            <w:shd w:val="clear" w:color="auto" w:fill="F7F9FC"/>
-          </w:tcPr>
-          <w:p>
-            <w:pPr>
-              <w:jc w:val="center"/>
-            </w:pPr>
-            <w:sdt>
-              <w:sdtPr>
-                <w:rPr>
-                  <w:rFonts w:ascii="Segoe UI Symbol" w:hAnsi="Segoe UI Symbol"/>
-                  <w:color w:val="0F4C9D"/>
-                  <w:sz w:val="22"/>
-                </w:rPr>
-                <w14:checkbox>
-                  <w14:checked w14:val="0"/>
-                  <w14:checkedState w14:val="2612" w14:font="Segoe UI Symbol"/>
-                  <w14:uncheckedState w14:val="2610" w14:font="Segoe UI Symbol"/>
-                </w14:checkbox>
-              </w:sdtPr>
-              <w:sdtContent>
-                <w:r>
-                  <w:rPr>
-                    <w:rFonts w:ascii="Segoe UI Symbol" w:hAnsi="Segoe UI Symbol"/>
-                    <w:color w:val="0F4C9D"/>
-                    <w:sz w:val="22"/>
-                  </w:rPr>
-                  <w:t>☐</w:t>
-                </w:r>
-              </w:sdtContent>
-            </w:sdt>
-          </w:p>
-        </w:tc>
-        <w:tc>
-          <w:tcPr>
-            <w:tcW w:type="dxa" w:w="3118"/>
-            <w:vAlign w:val="center"/>
-            <w:shd w:val="clear" w:color="auto" w:fill="F7F9FC"/>
-          </w:tcPr>
-          <w:p>
-            <w:pPr>
-              <w:jc w:val="left"/>
-            </w:pPr>
-          </w:p>
-        </w:tc>
-      </w:tr>
-      <w:tr>
-        <w:trPr>
-          <w:trHeight w:val="397" w:hRule="atLeast"/>
-        </w:trPr>
-        <w:tc>
-          <w:tcPr>
-            <w:tcW w:type="dxa" w:w="5216"/>
-            <w:vAlign w:val="center"/>
-          </w:tcPr>
-          <w:p>
-            <w:pPr>
-              <w:jc w:val="left"/>
-            </w:pPr>
-            <w:r>
-              <w:rPr>
-                <w:rFonts w:ascii="Poppins" w:hAnsi="Poppins"/>
-                <w:b w:val="0"/>
-                <w:color w:val="1E2633"/>
-                <w:sz w:val="16"/>
-              </w:rPr>
-              <w:t>Entrega de documentación (planos, fichas técnicas, garantía)</w:t>
-            </w:r>
-          </w:p>
-        </w:tc>
-        <w:tc>
-          <w:tcPr>
-            <w:tcW w:type="dxa" w:w="624"/>
-            <w:vAlign w:val="center"/>
-          </w:tcPr>
-          <w:p>
-            <w:pPr>
-              <w:jc w:val="center"/>
-            </w:pPr>
-            <w:sdt>
-              <w:sdtPr>
-                <w:rPr>
-                  <w:rFonts w:ascii="Segoe UI Symbol" w:hAnsi="Segoe UI Symbol"/>
-                  <w:color w:val="0F4C9D"/>
-                  <w:sz w:val="22"/>
-                </w:rPr>
-                <w14:checkbox>
-                  <w14:checked w14:val="0"/>
-                  <w14:checkedState w14:val="2612" w14:font="Segoe UI Symbol"/>
-                  <w14:uncheckedState w14:val="2610" w14:font="Segoe UI Symbol"/>
-                </w14:checkbox>
-              </w:sdtPr>
-              <w:sdtContent>
-                <w:r>
-                  <w:rPr>
-                    <w:rFonts w:ascii="Segoe UI Symbol" w:hAnsi="Segoe UI Symbol"/>
-                    <w:color w:val="0F4C9D"/>
-                    <w:sz w:val="22"/>
-                  </w:rPr>
-                  <w:t>☐</w:t>
-                </w:r>
-              </w:sdtContent>
-            </w:sdt>
-          </w:p>
-        </w:tc>
-        <w:tc>
-          <w:tcPr>
-            <w:tcW w:type="dxa" w:w="624"/>
-            <w:vAlign w:val="center"/>
-          </w:tcPr>
-          <w:p>
-            <w:pPr>
-              <w:jc w:val="center"/>
-            </w:pPr>
-            <w:sdt>
-              <w:sdtPr>
-                <w:rPr>
-                  <w:rFonts w:ascii="Segoe UI Symbol" w:hAnsi="Segoe UI Symbol"/>
-                  <w:color w:val="0F4C9D"/>
-                  <w:sz w:val="22"/>
-                </w:rPr>
-                <w14:checkbox>
-                  <w14:checked w14:val="0"/>
-                  <w14:checkedState w14:val="2612" w14:font="Segoe UI Symbol"/>
-                  <w14:uncheckedState w14:val="2610" w14:font="Segoe UI Symbol"/>
-                </w14:checkbox>
-              </w:sdtPr>
-              <w:sdtContent>
-                <w:r>
-                  <w:rPr>
-                    <w:rFonts w:ascii="Segoe UI Symbol" w:hAnsi="Segoe UI Symbol"/>
-                    <w:color w:val="0F4C9D"/>
-                    <w:sz w:val="22"/>
-                  </w:rPr>
-                  <w:t>☐</w:t>
-                </w:r>
-              </w:sdtContent>
-            </w:sdt>
-          </w:p>
-        </w:tc>
-        <w:tc>
-          <w:tcPr>
-            <w:tcW w:type="dxa" w:w="624"/>
-            <w:vAlign w:val="center"/>
-          </w:tcPr>
-          <w:p>
-            <w:pPr>
-              <w:jc w:val="center"/>
-            </w:pPr>
-            <w:sdt>
-              <w:sdtPr>
-                <w:rPr>
-                  <w:rFonts w:ascii="Segoe UI Symbol" w:hAnsi="Segoe UI Symbol"/>
-                  <w:color w:val="0F4C9D"/>
-                  <w:sz w:val="22"/>
-                </w:rPr>
-                <w14:checkbox>
-                  <w14:checked w14:val="0"/>
-                  <w14:checkedState w14:val="2612" w14:font="Segoe UI Symbol"/>
-                  <w14:uncheckedState w14:val="2610" w14:font="Segoe UI Symbol"/>
-                </w14:checkbox>
-              </w:sdtPr>
-              <w:sdtContent>
-                <w:r>
-                  <w:rPr>
-                    <w:rFonts w:ascii="Segoe UI Symbol" w:hAnsi="Segoe UI Symbol"/>
-                    <w:color w:val="0F4C9D"/>
-                    <w:sz w:val="22"/>
-                  </w:rPr>
-                  <w:t>☐</w:t>
-                </w:r>
-              </w:sdtContent>
-            </w:sdt>
-          </w:p>
-        </w:tc>
-        <w:tc>
-          <w:tcPr>
-            <w:tcW w:type="dxa" w:w="3118"/>
-            <w:vAlign w:val="center"/>
-          </w:tcPr>
-          <w:p>
-            <w:pPr>
-              <w:jc w:val="left"/>
-            </w:pPr>
-          </w:p>
-        </w:tc>
-      </w:tr>
-    </w:tbl>
-    <w:p>
-      <w:r>
-        <w:br w:type="page"/>
-      </w:r>
-    </w:p>
-    <w:tbl>
-      <w:tblPr>
-        <w:tblLook w:firstColumn="1" w:firstRow="1" w:lastColumn="0" w:lastRow="0" w:noHBand="0" w:noVBand="1" w:val="04A0"/>
-        <w:tblBorders>
-          <w:top w:val="nil"/>
-          <w:left w:val="nil"/>
-          <w:bottom w:val="nil"/>
-          <w:right w:val="nil"/>
-          <w:insideH w:val="nil"/>
-          <w:insideV w:val="nil"/>
-        </w:tblBorders>
-        <w:tblLayout w:type="fixed"/>
-        <w:tblCellMar>
-          <w:top w:w="0" w:type="dxa"/>
-          <w:left w:w="0" w:type="dxa"/>
-          <w:bottom w:w="30" w:type="dxa"/>
-          <w:right w:w="60" w:type="dxa"/>
-        </w:tblCellMar>
-        <w:tblLayout w:type="fixed"/>
-        <w:tblW w:w="10206" w:type="dxa"/>
-      </w:tblPr>
-      <w:tblGrid>
-        <w:gridCol w:w="510"/>
-        <w:gridCol w:w="9695"/>
-      </w:tblGrid>
-      <w:tr>
-        <w:trPr>
-          <w:trHeight w:val="369" w:hRule="atLeast"/>
-        </w:trPr>
-        <w:tc>
-          <w:tcPr>
-            <w:tcW w:type="dxa" w:w="510"/>
-            <w:shd w:val="clear" w:color="auto" w:fill="0F4C9D"/>
-            <w:vAlign w:val="center"/>
-            <w:tcBorders>
-              <w:bottom w:val="single" w:sz="12" w:space="0" w:color="FAC70C"/>
-            </w:tcBorders>
-          </w:tcPr>
-          <w:p>
-            <w:pPr>
-              <w:jc w:val="center"/>
-            </w:pPr>
-            <w:r>
-              <w:rPr>
-                <w:rFonts w:ascii="Poppins SemiBold" w:hAnsi="Poppins SemiBold"/>
-                <w:b w:val="0"/>
-                <w:color w:val="FFFFFF"/>
-                <w:sz w:val="19"/>
-              </w:rPr>
-              <w:t>4</w:t>
-            </w:r>
-          </w:p>
-        </w:tc>
-        <w:tc>
-          <w:tcPr>
-            <w:tcW w:type="dxa" w:w="9694"/>
-            <w:vAlign w:val="center"/>
-            <w:tcBorders>
-              <w:bottom w:val="single" w:sz="12" w:space="0" w:color="FAC70C"/>
-            </w:tcBorders>
-          </w:tcPr>
-          <w:p>
-            <w:pPr>
-              <w:jc w:val="left"/>
-            </w:pPr>
-            <w:r>
-              <w:rPr>
-                <w:rFonts w:ascii="Poppins SemiBold" w:hAnsi="Poppins SemiBold"/>
-                <w:b w:val="0"/>
-                <w:color w:val="0F4C9D"/>
-                <w:sz w:val="20"/>
-              </w:rPr>
-              <w:t xml:space="preserve">  GARANTÍA</w:t>
-            </w:r>
-          </w:p>
-        </w:tc>
-      </w:tr>
-    </w:tbl>
-    <w:p>
-      <w:pPr>
-        <w:spacing w:before="0" w:after="0" w:line="80" w:lineRule="exact"/>
-      </w:pPr>
-    </w:p>
-    <w:p>
-      <w:pPr>
-        <w:spacing w:before="0" w:after="60"/>
-        <w:jc w:val="both"/>
-      </w:pPr>
-      <w:r>
-        <w:rPr>
-          <w:rFonts w:ascii="Poppins" w:hAnsi="Poppins"/>
-          <w:b w:val="0"/>
-          <w:color w:val="1E2633"/>
-          <w:sz w:val="18"/>
-        </w:rPr>
-        <w:t>RACKSA ECUADOR garantiza los bienes y trabajos entregados contra defectos de fabricación y de montaje por un período de ______ (____) meses, contados a partir de la fecha de firma de la presente acta. La garantía no cubre daños ocasionados por impactos de montacargas u otros equipos, cargas superiores a las capacidades rotuladas, modificaciones, desmontajes o reubicaciones realizadas por terceros, ni el uso de los elementos para un fin distinto al especificado.</w:t>
-      </w:r>
-    </w:p>
-    <w:p>
-      <w:pPr>
-        <w:spacing w:before="0" w:after="0"/>
-        <w:jc w:val="both"/>
-      </w:pPr>
-      <w:r>
-        <w:rPr>
-          <w:rFonts w:ascii="Poppins" w:hAnsi="Poppins"/>
-          <w:b w:val="0"/>
-          <w:color w:val="1E2633"/>
-          <w:sz w:val="18"/>
-        </w:rPr>
-        <w:t>Se recomienda al CLIENTE realizar inspecciones periódicas de la estructura y reportar de inmediato cualquier elemento golpeado o deformado para su evaluación técnica.</w:t>
-      </w:r>
-    </w:p>
-    <w:p>
-      <w:pPr>
-        <w:spacing w:before="0" w:after="0" w:line="180" w:lineRule="exact"/>
-      </w:pPr>
-    </w:p>
-    <w:tbl>
-      <w:tblPr>
-        <w:tblLook w:firstColumn="1" w:firstRow="1" w:lastColumn="0" w:lastRow="0" w:noHBand="0" w:noVBand="1" w:val="04A0"/>
-        <w:tblBorders>
-          <w:top w:val="nil"/>
-          <w:left w:val="nil"/>
-          <w:bottom w:val="nil"/>
-          <w:right w:val="nil"/>
-          <w:insideH w:val="nil"/>
-          <w:insideV w:val="nil"/>
-        </w:tblBorders>
-        <w:tblLayout w:type="fixed"/>
-        <w:tblCellMar>
-          <w:top w:w="0" w:type="dxa"/>
-          <w:left w:w="0" w:type="dxa"/>
-          <w:bottom w:w="30" w:type="dxa"/>
-          <w:right w:w="60" w:type="dxa"/>
-        </w:tblCellMar>
-        <w:tblLayout w:type="fixed"/>
-        <w:tblW w:w="10206" w:type="dxa"/>
-      </w:tblPr>
-      <w:tblGrid>
-        <w:gridCol w:w="510"/>
-        <w:gridCol w:w="9695"/>
-      </w:tblGrid>
-      <w:tr>
-        <w:trPr>
-          <w:trHeight w:val="369" w:hRule="atLeast"/>
-        </w:trPr>
-        <w:tc>
-          <w:tcPr>
-            <w:tcW w:type="dxa" w:w="510"/>
-            <w:shd w:val="clear" w:color="auto" w:fill="0F4C9D"/>
-            <w:vAlign w:val="center"/>
-            <w:tcBorders>
-              <w:bottom w:val="single" w:sz="12" w:space="0" w:color="FAC70C"/>
-            </w:tcBorders>
-          </w:tcPr>
-          <w:p>
-            <w:pPr>
-              <w:jc w:val="center"/>
-            </w:pPr>
-            <w:r>
-              <w:rPr>
-                <w:rFonts w:ascii="Poppins SemiBold" w:hAnsi="Poppins SemiBold"/>
-                <w:b w:val="0"/>
-                <w:color w:val="FFFFFF"/>
-                <w:sz w:val="19"/>
-              </w:rPr>
-              <w:t>5</w:t>
-            </w:r>
-          </w:p>
-        </w:tc>
-        <w:tc>
-          <w:tcPr>
-            <w:tcW w:type="dxa" w:w="9694"/>
-            <w:vAlign w:val="center"/>
-            <w:tcBorders>
-              <w:bottom w:val="single" w:sz="12" w:space="0" w:color="FAC70C"/>
-            </w:tcBorders>
-          </w:tcPr>
-          <w:p>
-            <w:pPr>
+              <w:keepNext/>
               <w:jc w:val="left"/>
             </w:pPr>
             <w:r>
@@ -2808,54 +1074,6 @@
       <w:tblGrid>
         <w:gridCol w:w="10206"/>
       </w:tblGrid>
-      <w:tr>
-        <w:trPr>
-          <w:trHeight w:val="425" w:hRule="atLeast"/>
-        </w:trPr>
-        <w:tc>
-          <w:tcPr>
-            <w:tcW w:type="dxa" w:w="10205"/>
-            <w:vAlign w:val="center"/>
-          </w:tcPr>
-          <w:p>
-            <w:pPr>
-              <w:jc w:val="left"/>
-            </w:pPr>
-          </w:p>
-        </w:tc>
-      </w:tr>
-      <w:tr>
-        <w:trPr>
-          <w:trHeight w:val="425" w:hRule="atLeast"/>
-        </w:trPr>
-        <w:tc>
-          <w:tcPr>
-            <w:tcW w:type="dxa" w:w="10205"/>
-            <w:vAlign w:val="center"/>
-          </w:tcPr>
-          <w:p>
-            <w:pPr>
-              <w:jc w:val="left"/>
-            </w:pPr>
-          </w:p>
-        </w:tc>
-      </w:tr>
-      <w:tr>
-        <w:trPr>
-          <w:trHeight w:val="425" w:hRule="atLeast"/>
-        </w:trPr>
-        <w:tc>
-          <w:tcPr>
-            <w:tcW w:type="dxa" w:w="10205"/>
-            <w:vAlign w:val="center"/>
-          </w:tcPr>
-          <w:p>
-            <w:pPr>
-              <w:jc w:val="left"/>
-            </w:pPr>
-          </w:p>
-        </w:tc>
-      </w:tr>
       <w:tr>
         <w:trPr>
           <w:trHeight w:val="425" w:hRule="atLeast"/>
@@ -2950,6 +1168,7 @@
           </w:tcPr>
           <w:p>
             <w:pPr>
+              <w:keepNext/>
               <w:jc w:val="center"/>
             </w:pPr>
             <w:r>
@@ -2959,7 +1178,7 @@
                 <w:color w:val="FFFFFF"/>
                 <w:sz w:val="19"/>
               </w:rPr>
-              <w:t>6</w:t>
+              <w:t>4</w:t>
             </w:r>
           </w:p>
         </w:tc>
@@ -2973,6 +1192,7 @@
           </w:tcPr>
           <w:p>
             <w:pPr>
+              <w:keepNext/>
               <w:jc w:val="left"/>
             </w:pPr>
             <w:r>
@@ -3006,7 +1226,7 @@
           <w:color w:val="1E2633"/>
           <w:sz w:val="18"/>
         </w:rPr>
-        <w:t>Con la firma de la presente acta, el CLIENTE declara recibir a entera satisfacción los bienes y trabajos detallados, salvo las observaciones anotadas en el punto 5. Para constancia, las partes firman en dos (2) ejemplares de igual valor y contenido.</w:t>
+        <w:t>Con la firma de la presente acta, el CLIENTE declara recibir a entera satisfacción los bienes y trabajos detallados, salvo las observaciones anotadas en el punto 3. Para constancia, las partes firman en dos (2) ejemplares de igual valor y contenido.</w:t>
       </w:r>
     </w:p>
     <w:p>
@@ -3075,16 +1295,6 @@
           </w:p>
           <w:p>
             <w:pPr>
-              <w:spacing w:before="0" w:after="0"/>
-            </w:pPr>
-          </w:p>
-          <w:p>
-            <w:pPr>
-              <w:spacing w:before="0" w:after="0"/>
-            </w:pPr>
-          </w:p>
-          <w:p>
-            <w:pPr>
               <w:spacing w:before="160" w:after="0"/>
               <w:ind w:left="340" w:right="340"/>
               <w:pBdr>
@@ -3104,7 +1314,7 @@
           </w:p>
           <w:p>
             <w:pPr>
-              <w:spacing w:before="100" w:after="0"/>
+              <w:spacing w:before="60" w:after="0"/>
               <w:ind w:left="227"/>
             </w:pPr>
             <w:r>
@@ -3128,7 +1338,7 @@
           </w:p>
           <w:p>
             <w:pPr>
-              <w:spacing w:before="100" w:after="0"/>
+              <w:spacing w:before="60" w:after="0"/>
               <w:ind w:left="227"/>
             </w:pPr>
             <w:r>
@@ -3152,7 +1362,7 @@
           </w:p>
           <w:p>
             <w:pPr>
-              <w:spacing w:before="100" w:after="0"/>
+              <w:spacing w:before="60" w:after="0"/>
               <w:ind w:left="227"/>
             </w:pPr>
             <w:r>
@@ -3176,7 +1386,7 @@
           </w:p>
           <w:p>
             <w:pPr>
-              <w:spacing w:before="100" w:after="0"/>
+              <w:spacing w:before="60" w:after="0"/>
               <w:ind w:left="227"/>
             </w:pPr>
             <w:r>
@@ -3200,7 +1410,7 @@
           </w:p>
           <w:p>
             <w:pPr>
-              <w:spacing w:before="0" w:after="100"/>
+              <w:spacing w:before="0" w:after="40"/>
             </w:pPr>
           </w:p>
         </w:tc>
@@ -3240,16 +1450,6 @@
           </w:p>
           <w:p>
             <w:pPr>
-              <w:spacing w:before="0" w:after="0"/>
-            </w:pPr>
-          </w:p>
-          <w:p>
-            <w:pPr>
-              <w:spacing w:before="0" w:after="0"/>
-            </w:pPr>
-          </w:p>
-          <w:p>
-            <w:pPr>
               <w:spacing w:before="160" w:after="0"/>
               <w:ind w:left="340" w:right="340"/>
               <w:pBdr>
@@ -3269,7 +1469,7 @@
           </w:p>
           <w:p>
             <w:pPr>
-              <w:spacing w:before="100" w:after="0"/>
+              <w:spacing w:before="60" w:after="0"/>
               <w:ind w:left="227"/>
             </w:pPr>
             <w:r>
@@ -3293,7 +1493,7 @@
           </w:p>
           <w:p>
             <w:pPr>
-              <w:spacing w:before="100" w:after="0"/>
+              <w:spacing w:before="60" w:after="0"/>
               <w:ind w:left="227"/>
             </w:pPr>
             <w:r>
@@ -3317,7 +1517,7 @@
           </w:p>
           <w:p>
             <w:pPr>
-              <w:spacing w:before="100" w:after="0"/>
+              <w:spacing w:before="60" w:after="0"/>
               <w:ind w:left="227"/>
             </w:pPr>
             <w:r>
@@ -3341,7 +1541,7 @@
           </w:p>
           <w:p>
             <w:pPr>
-              <w:spacing w:before="100" w:after="0"/>
+              <w:spacing w:before="60" w:after="0"/>
               <w:ind w:left="227"/>
             </w:pPr>
             <w:r>
@@ -3365,7 +1565,7 @@
           </w:p>
           <w:p>
             <w:pPr>
-              <w:spacing w:before="140" w:after="0"/>
+              <w:spacing w:before="40" w:after="0"/>
               <w:ind w:right="227"/>
               <w:jc w:val="right"/>
             </w:pPr>
@@ -3381,7 +1581,7 @@
           </w:p>
           <w:p>
             <w:pPr>
-              <w:spacing w:before="0" w:after="100"/>
+              <w:spacing w:before="0" w:after="40"/>
             </w:pPr>
           </w:p>
         </w:tc>
@@ -3715,7 +1915,7 @@
               <w:color w:val="5B6475"/>
               <w:sz w:val="16"/>
             </w:rPr>
-            <w:t>Obra · Instalación · Suministro</w:t>
+            <w:t>De obra e instalación · Sistemas de almacenamiento</w:t>
           </w:r>
         </w:p>
         <w:p>

</xml_diff>